<commit_message>
docs: add clickable GitHub repo link to both articles
Added the real repo URL (https://github.com/FawadAli1122/Khyber-Pakhtunkhwa-Healthcare-Planning)
as a genuine clickable hyperlink (not just plain text) in the "Try it
yourself" section of the Medium article and the closing project mention
in the LinkedIn article.

Co-Authored-By: Claude Sonnet 5 <noreply@anthropic.com>
</commit_message>
<xml_diff>
--- a/articles/LinkedIn_Article_AI_GIS_Healthcare_Decision_Making.docx
+++ b/articles/LinkedIn_Article_AI_GIS_Healthcare_Decision_Making.docx
@@ -327,8 +327,24 @@
           <w:b/>
           <w:i w:val="0"/>
         </w:rPr>
-        <w:t>The full project — pipeline, dashboard, admin panel, bot, and even the complete AI-driven design/build/test history behind every feature — is open-source on GitHub, with a full step-by-step setup guide.</w:t>
+        <w:t>The full project — pipeline, dashboard, admin panel, bot, and even the complete AI-driven design/build/test history behind every feature — is open-source on GitHub, with a full step-by-step setup guide:</w:t>
       </w:r>
+    </w:p>
+    <w:p>
+      <w:pPr>
+        <w:spacing w:after="200"/>
+      </w:pPr>
+      <w:hyperlink r:id="rId11">
+        <w:r>
+          <w:rPr>
+            <w:color w:val="2A78D6"/>
+            <w:u w:val="single"/>
+            <w:b/>
+            <w:sz w:val="22"/>
+          </w:rPr>
+          <w:t>https://github.com/FawadAli1122/Khyber-Pakhtunkhwa-Healthcare-Planning</w:t>
+        </w:r>
+      </w:hyperlink>
     </w:p>
     <w:p>
       <w:pPr>

</xml_diff>